<commit_message>
Advice document: its title once, and no file path in its footer
The close-out evidence review rendered the .docx and found it opened with
its title twice: a Title paragraph from pandoc's title metadata ("Pivot Prime
diagnostic advice, all six versions") above the document's own first heading
("The diagnostic advice, all six versions"). The metadata is removed;
word/document.xml now has one H1 and no Title paragraph, and the text
starts "The diagnostic advice, all six versions" then "For Iram. Your v3
slide 8:" (read back with textutil). The footer named a source file path,
which means nothing to her; it now says the document is generated from the
same text the website uses. Content otherwise unchanged; regenerated by the
script, not edited.

Co-Authored-By: Claude Opus 5.5 <noreply@anthropic.com>
</commit_message>
<xml_diff>
--- a/docs/FOR-IRAM-diagnostic-advice.docx
+++ b/docs/FOR-IRAM-diagnostic-advice.docx
@@ -2,14 +2,6 @@
 <file path=word/document.xml><?xml version="1.0" encoding="utf-8"?>
 <w:document xmlns:w="http://schemas.openxmlformats.org/wordprocessingml/2006/main" xmlns:m="http://schemas.openxmlformats.org/officeDocument/2006/math" xmlns:r="http://schemas.openxmlformats.org/officeDocument/2006/relationships" xmlns:o="urn:schemas-microsoft-com:office:office" xmlns:v="urn:schemas-microsoft-com:vml" xmlns:w10="urn:schemas-microsoft-com:office:word" xmlns:a="http://schemas.openxmlformats.org/drawingml/2006/main" xmlns:pic="http://schemas.openxmlformats.org/drawingml/2006/picture" xmlns:wp="http://schemas.openxmlformats.org/drawingml/2006/wordprocessingDrawing">
   <w:body>
-    <w:p>
-      <w:pPr>
-        <w:pStyle w:val="Title"/>
-      </w:pPr>
-      <w:r>
-        <w:t xml:space="preserve">Pivot Prime diagnostic advice, all six versions</w:t>
-      </w:r>
-    </w:p>
     <w:bookmarkStart w:id="34" w:name="the-diagnostic-advice-all-six-versions"/>
     <w:p>
       <w:pPr>
@@ -1203,29 +1195,7 @@
           <w:i/>
           <w:iCs/>
         </w:rPr>
-        <w:t xml:space="preserve">Generated from</w:t>
-      </w:r>
-      <w:r>
-        <w:rPr>
-          <w:i/>
-          <w:iCs/>
-        </w:rPr>
-        <w:t xml:space="preserve"> </w:t>
-      </w:r>
-      <w:r>
-        <w:rPr>
-          <w:rStyle w:val="VerbatimChar"/>
-          <w:i/>
-          <w:iCs/>
-        </w:rPr>
-        <w:t xml:space="preserve">src/content/diagnostic-quiz.ts</w:t>
-      </w:r>
-      <w:r>
-        <w:rPr>
-          <w:i/>
-          <w:iCs/>
-        </w:rPr>
-        <w:t xml:space="preserve">. If you change any wording here, send the change and we will put it into the site; editing this document does not alter the website.</w:t>
+        <w:t xml:space="preserve">Generated from the same text the website itself uses. If you change any wording here, send the change and we will put it into the site; editing this document does not alter the website.</w:t>
       </w:r>
     </w:p>
     <w:bookmarkEnd w:id="32"/>

</xml_diff>